<commit_message>
docs: fix navigation tab names in user manual
Виправлено назви вкладок відповідно до реального UI:
- "DataLogger" → "Логи"
- "Прив'язки" → "Обладнання"

Co-Authored-By: Claude Sonnet 4.6 <noreply@anthropic.com>
</commit_message>
<xml_diff>
--- a/docs/ModESP_v4_user_manual_ua.docx
+++ b/docs/ModESP_v4_user_manual_ua.docx
@@ -2158,7 +2158,7 @@
           <w:sz w:val="22"/>
           <w:szCs w:val="22"/>
         </w:rPr>
-        <w:t xml:space="preserve">Відкрийте веб-інтерфейс → меню «Прив'язки»</w:t>
+        <w:t xml:space="preserve">Відкрийте веб-інтерфейс → меню «Обладнання»</w:t>
       </w:r>
     </w:p>
     <w:p>
@@ -2276,7 +2276,7 @@
                 <w:sz w:val="22"/>
                 <w:szCs w:val="22"/>
               </w:rPr>
-              <w:t xml:space="preserve">Після збереження прив'язок контролер автоматично визначить доступні функції. Наприклад, якщо підключено реле відтайки — стануть доступними електрична розморозка та розморозка гарячим газом.</w:t>
+              <w:t xml:space="preserve">Після збереження в «Обладнання» контролер автоматично визначить доступні функції. Наприклад, якщо підключено реле відтайки — стануть доступними електрична розморозка та розморозка гарячим газом.</w:t>
             </w:r>
           </w:p>
         </w:tc>
@@ -2945,7 +2945,7 @@
                 <w:sz w:val="20"/>
                 <w:szCs w:val="20"/>
               </w:rPr>
-              <w:t xml:space="preserve">DataLogger</w:t>
+              <w:t xml:space="preserve">Логи</w:t>
             </w:r>
           </w:p>
         </w:tc>
@@ -2976,7 +2976,7 @@
                 <w:sz w:val="20"/>
                 <w:szCs w:val="20"/>
               </w:rPr>
-              <w:t xml:space="preserve">База даних</w:t>
+              <w:t xml:space="preserve">Активність</w:t>
             </w:r>
           </w:p>
         </w:tc>
@@ -3040,7 +3040,7 @@
                 <w:sz w:val="20"/>
                 <w:szCs w:val="20"/>
               </w:rPr>
-              <w:t xml:space="preserve">Мережа</w:t>
+              <w:t xml:space="preserve">Обладнання</w:t>
             </w:r>
           </w:p>
         </w:tc>
@@ -3071,7 +3071,7 @@
                 <w:sz w:val="20"/>
                 <w:szCs w:val="20"/>
               </w:rPr>
-              <w:t xml:space="preserve">WiFi</w:t>
+              <w:t xml:space="preserve">Ланцюг</w:t>
             </w:r>
           </w:p>
         </w:tc>
@@ -3102,7 +3102,7 @@
                 <w:sz w:val="20"/>
                 <w:szCs w:val="20"/>
               </w:rPr>
-              <w:t xml:space="preserve">WiFi, MQTT-брокер налаштування</w:t>
+              <w:t xml:space="preserve">Призначення драйверів та виходів/входів (Bindings)</w:t>
             </w:r>
           </w:p>
         </w:tc>
@@ -3135,7 +3135,7 @@
                 <w:sz w:val="20"/>
                 <w:szCs w:val="20"/>
               </w:rPr>
-              <w:t xml:space="preserve">Система</w:t>
+              <w:t xml:space="preserve">Мережа</w:t>
             </w:r>
           </w:p>
         </w:tc>
@@ -3166,7 +3166,7 @@
                 <w:sz w:val="20"/>
                 <w:szCs w:val="20"/>
               </w:rPr>
-              <w:t xml:space="preserve">Шестерня</w:t>
+              <w:t xml:space="preserve">WiFi</w:t>
             </w:r>
           </w:p>
         </w:tc>
@@ -3197,7 +3197,7 @@
                 <w:sz w:val="20"/>
                 <w:szCs w:val="20"/>
               </w:rPr>
-              <w:t xml:space="preserve">OTA-оновлення, час/NTP, скидання до заводських</w:t>
+              <w:t xml:space="preserve">WiFi, MQTT-брокер налаштування</w:t>
             </w:r>
           </w:p>
         </w:tc>
@@ -3230,7 +3230,7 @@
                 <w:sz w:val="20"/>
                 <w:szCs w:val="20"/>
               </w:rPr>
-              <w:t xml:space="preserve">Прив'язки</w:t>
+              <w:t xml:space="preserve">Система</w:t>
             </w:r>
           </w:p>
         </w:tc>
@@ -3261,7 +3261,7 @@
                 <w:sz w:val="20"/>
                 <w:szCs w:val="20"/>
               </w:rPr>
-              <w:t xml:space="preserve">Плата</w:t>
+              <w:t xml:space="preserve">Мікросхема</w:t>
             </w:r>
           </w:p>
         </w:tc>
@@ -3292,7 +3292,7 @@
                 <w:sz w:val="20"/>
                 <w:szCs w:val="20"/>
               </w:rPr>
-              <w:t xml:space="preserve">Призначення драйверів та виходів/входів</w:t>
+              <w:t xml:space="preserve">OTA-оновлення, час/NTP, скидання до заводських</w:t>
             </w:r>
           </w:p>
         </w:tc>
@@ -14497,7 +14497,7 @@
           <w:sz w:val="22"/>
           <w:szCs w:val="22"/>
         </w:rPr>
-        <w:t xml:space="preserve">DataLogger записує до 6 каналів температури на вбудовану flash-пам'ять (LittleFS) та веде журнал подій. Дані доступні через веб-інтерфейс у вигляді інтерактивного SVG-графіку або для завантаження як CSV-файл.</w:t>
+        <w:t xml:space="preserve">Розділ «Логи» записує до 6 каналів температури на вбудовану flash-пам'ять (LittleFS) та веде журнал подій. Дані доступні через веб-інтерфейс у вигляді інтерактивного SVG-графіку або для завантаження як CSV-файл.</w:t>
       </w:r>
     </w:p>
     <w:p>
@@ -15717,7 +15717,7 @@
           <w:sz w:val="22"/>
           <w:szCs w:val="22"/>
         </w:rPr>
-        <w:t xml:space="preserve">Графік відкривається у розділі "DataLogger":</w:t>
+        <w:t xml:space="preserve">Графік відкривається у розділі «Логи»:</w:t>
       </w:r>
     </w:p>
     <w:p>
@@ -19758,7 +19758,7 @@
           <w:sz w:val="22"/>
           <w:szCs w:val="22"/>
         </w:rPr>
-        <w:t xml:space="preserve">Перевірте прив'язку датчика у розділі "Прив'язки"</w:t>
+        <w:t xml:space="preserve">Перевірте прив'язку датчика у розділі «Обладнання»</w:t>
       </w:r>
     </w:p>
     <w:p>

</xml_diff>